<commit_message>
Update report: corrected annotation, per-cohort methylation direction, GD150 reversal
</commit_message>
<xml_diff>
--- a/CpG_Pipeline_Progress_Report_1.docx
+++ b/CpG_Pipeline_Progress_Report_1.docx
@@ -90,7 +90,7 @@
           <w:sz w:val="22"/>
           <w:szCs w:val="22"/>
         </w:rPr>
-        <w:t xml:space="preserve">The central scientific question is: do different types of early-life adversity — wildfire smoke exposure, maternal obesity, preconception stress, and circulating cfDNA changes — leave convergent methylation marks at this locus? Rather than analysing each cohort in isolation (underpowered, n = 11–21), the pipeline is designed to pool evidence across all nine cohorts simultaneously.</w:t>
+        <w:t xml:space="preserve">The central scientific question is: do different types of early-life adversity — wildfire smoke exposure, maternal obesity, preconception stress, and circulating cfDNA changes — leave convergent methylation marks at this locus? Rather than analysing each cohort in isolation (underpowered, n = 11–21), the pipeline pools evidence across all nine cohorts simultaneously.</w:t>
       </w:r>
     </w:p>
     <w:p>
@@ -2060,7 +2060,7 @@
           <w:sz w:val="22"/>
           <w:szCs w:val="22"/>
         </w:rPr>
-        <w:t xml:space="preserve">MOFA+ Factor 3 top CpGs clustered tightly in a 74 bp window: chr10:2435505–2435579 (macaque) = chr22:49,047,163–49,047,237 (human hg38)</w:t>
+        <w:t xml:space="preserve">MOFA+ Factor 3 top CpGs form a tight 74 bp cluster: chr10:2435505–2435579 (macaque) / chr22:49,047,163–49,047,237 (hg38)</w:t>
       </w:r>
     </w:p>
     <w:p>
@@ -2508,410 +2508,7 @@
           <w:sz w:val="22"/>
           <w:szCs w:val="22"/>
         </w:rPr>
-        <w:t xml:space="preserve">MOFA+ Factor 3 top CpG weights are not distributed randomly across the gene body. Eight of the ten highest-weight CpGs cluster within a 74 bp window:</w:t>
-      </w:r>
-    </w:p>
-    <w:p>
-      <w:pPr>
-        <w:spacing w:after="60" w:before="60"/>
-      </w:pPr>
-      <w:r>
-        <w:t xml:space="preserve"/>
-      </w:r>
-    </w:p>
-    <w:tbl>
-      <w:tblPr>
-        <w:tblW w:type="dxa" w:w="9360"/>
-        <w:tblBorders>
-          <w:top w:val="single" w:color="auto" w:sz="4"/>
-          <w:left w:val="single" w:color="auto" w:sz="4"/>
-          <w:bottom w:val="single" w:color="auto" w:sz="4"/>
-          <w:right w:val="single" w:color="auto" w:sz="4"/>
-          <w:insideH w:val="single" w:color="auto" w:sz="4"/>
-          <w:insideV w:val="single" w:color="auto" w:sz="4"/>
-        </w:tblBorders>
-      </w:tblPr>
-      <w:tblGrid>
-        <w:gridCol w:w="2800"/>
-        <w:gridCol w:w="3280"/>
-        <w:gridCol w:w="3280"/>
-      </w:tblGrid>
-      <w:tr>
-        <w:trPr>
-          <w:tblHeader/>
-        </w:trPr>
-        <w:tc>
-          <w:tcPr>
-            <w:tcW w:type="dxa" w:w="2800"/>
-            <w:tcBorders>
-              <w:top w:val="single" w:color="CCCCCC" w:sz="1"/>
-              <w:left w:val="single" w:color="CCCCCC" w:sz="1"/>
-              <w:bottom w:val="single" w:color="CCCCCC" w:sz="1"/>
-              <w:right w:val="single" w:color="CCCCCC" w:sz="1"/>
-            </w:tcBorders>
-            <w:shd w:fill="2C5F8A" w:val="clear"/>
-            <w:tcMar>
-              <w:top w:type="dxa" w:w="80"/>
-              <w:left w:type="dxa" w:w="120"/>
-              <w:bottom w:type="dxa" w:w="80"/>
-              <w:right w:type="dxa" w:w="120"/>
-            </w:tcMar>
-          </w:tcPr>
-          <w:p>
-            <w:r>
-              <w:rPr>
-                <w:rFonts w:ascii="Arial" w:cs="Arial" w:eastAsia="Arial" w:hAnsi="Arial"/>
-                <w:b/>
-                <w:bCs/>
-                <w:color w:val="FFFFFF"/>
-                <w:sz w:val="20"/>
-                <w:szCs w:val="20"/>
-              </w:rPr>
-              <w:t xml:space="preserve">Feature</w:t>
-            </w:r>
-          </w:p>
-        </w:tc>
-        <w:tc>
-          <w:tcPr>
-            <w:tcW w:type="dxa" w:w="3280"/>
-            <w:tcBorders>
-              <w:top w:val="single" w:color="CCCCCC" w:sz="1"/>
-              <w:left w:val="single" w:color="CCCCCC" w:sz="1"/>
-              <w:bottom w:val="single" w:color="CCCCCC" w:sz="1"/>
-              <w:right w:val="single" w:color="CCCCCC" w:sz="1"/>
-            </w:tcBorders>
-            <w:shd w:fill="2C5F8A" w:val="clear"/>
-            <w:tcMar>
-              <w:top w:type="dxa" w:w="80"/>
-              <w:left w:type="dxa" w:w="120"/>
-              <w:bottom w:type="dxa" w:w="80"/>
-              <w:right w:type="dxa" w:w="120"/>
-            </w:tcMar>
-          </w:tcPr>
-          <w:p>
-            <w:r>
-              <w:rPr>
-                <w:rFonts w:ascii="Arial" w:cs="Arial" w:eastAsia="Arial" w:hAnsi="Arial"/>
-                <w:b/>
-                <w:bCs/>
-                <w:color w:val="FFFFFF"/>
-                <w:sz w:val="20"/>
-                <w:szCs w:val="20"/>
-              </w:rPr>
-              <w:t xml:space="preserve">Macaque (rheMac)</w:t>
-            </w:r>
-          </w:p>
-        </w:tc>
-        <w:tc>
-          <w:tcPr>
-            <w:tcW w:type="dxa" w:w="3280"/>
-            <w:tcBorders>
-              <w:top w:val="single" w:color="CCCCCC" w:sz="1"/>
-              <w:left w:val="single" w:color="CCCCCC" w:sz="1"/>
-              <w:bottom w:val="single" w:color="CCCCCC" w:sz="1"/>
-              <w:right w:val="single" w:color="CCCCCC" w:sz="1"/>
-            </w:tcBorders>
-            <w:shd w:fill="2C5F8A" w:val="clear"/>
-            <w:tcMar>
-              <w:top w:type="dxa" w:w="80"/>
-              <w:left w:type="dxa" w:w="120"/>
-              <w:bottom w:type="dxa" w:w="80"/>
-              <w:right w:type="dxa" w:w="120"/>
-            </w:tcMar>
-          </w:tcPr>
-          <w:p>
-            <w:r>
-              <w:rPr>
-                <w:rFonts w:ascii="Arial" w:cs="Arial" w:eastAsia="Arial" w:hAnsi="Arial"/>
-                <w:b/>
-                <w:bCs/>
-                <w:color w:val="FFFFFF"/>
-                <w:sz w:val="20"/>
-                <w:szCs w:val="20"/>
-              </w:rPr>
-              <w:t xml:space="preserve">Human (hg38)</w:t>
-            </w:r>
-          </w:p>
-        </w:tc>
-      </w:tr>
-      <w:tr>
-        <w:tc>
-          <w:tcPr>
-            <w:tcW w:type="dxa" w:w="2800"/>
-            <w:tcBorders>
-              <w:top w:val="single" w:color="CCCCCC" w:sz="1"/>
-              <w:left w:val="single" w:color="CCCCCC" w:sz="1"/>
-              <w:bottom w:val="single" w:color="CCCCCC" w:sz="1"/>
-              <w:right w:val="single" w:color="CCCCCC" w:sz="1"/>
-            </w:tcBorders>
-            <w:shd w:fill="FFFFFF" w:val="clear"/>
-            <w:tcMar>
-              <w:top w:type="dxa" w:w="80"/>
-              <w:left w:type="dxa" w:w="120"/>
-              <w:bottom w:type="dxa" w:w="80"/>
-              <w:right w:type="dxa" w:w="120"/>
-            </w:tcMar>
-          </w:tcPr>
-          <w:p>
-            <w:r>
-              <w:rPr>
-                <w:rFonts w:ascii="Arial" w:cs="Arial" w:eastAsia="Arial" w:hAnsi="Arial"/>
-                <w:sz w:val="20"/>
-                <w:szCs w:val="20"/>
-              </w:rPr>
-              <w:t xml:space="preserve">Full analysis region</w:t>
-            </w:r>
-          </w:p>
-        </w:tc>
-        <w:tc>
-          <w:tcPr>
-            <w:tcW w:type="dxa" w:w="3280"/>
-            <w:tcBorders>
-              <w:top w:val="single" w:color="CCCCCC" w:sz="1"/>
-              <w:left w:val="single" w:color="CCCCCC" w:sz="1"/>
-              <w:bottom w:val="single" w:color="CCCCCC" w:sz="1"/>
-              <w:right w:val="single" w:color="CCCCCC" w:sz="1"/>
-            </w:tcBorders>
-            <w:shd w:fill="FFFFFF" w:val="clear"/>
-            <w:tcMar>
-              <w:top w:type="dxa" w:w="80"/>
-              <w:left w:type="dxa" w:w="120"/>
-              <w:bottom w:type="dxa" w:w="80"/>
-              <w:right w:type="dxa" w:w="120"/>
-            </w:tcMar>
-          </w:tcPr>
-          <w:p>
-            <w:r>
-              <w:rPr>
-                <w:rFonts w:ascii="Arial" w:cs="Arial" w:eastAsia="Arial" w:hAnsi="Arial"/>
-                <w:sz w:val="20"/>
-                <w:szCs w:val="20"/>
-              </w:rPr>
-              <w:t xml:space="preserve">chr10:2432261–2443263</w:t>
-            </w:r>
-          </w:p>
-        </w:tc>
-        <w:tc>
-          <w:tcPr>
-            <w:tcW w:type="dxa" w:w="3280"/>
-            <w:tcBorders>
-              <w:top w:val="single" w:color="CCCCCC" w:sz="1"/>
-              <w:left w:val="single" w:color="CCCCCC" w:sz="1"/>
-              <w:bottom w:val="single" w:color="CCCCCC" w:sz="1"/>
-              <w:right w:val="single" w:color="CCCCCC" w:sz="1"/>
-            </w:tcBorders>
-            <w:shd w:fill="FFFFFF" w:val="clear"/>
-            <w:tcMar>
-              <w:top w:type="dxa" w:w="80"/>
-              <w:left w:type="dxa" w:w="120"/>
-              <w:bottom w:type="dxa" w:w="80"/>
-              <w:right w:type="dxa" w:w="120"/>
-            </w:tcMar>
-          </w:tcPr>
-          <w:p>
-            <w:r>
-              <w:rPr>
-                <w:rFonts w:ascii="Arial" w:cs="Arial" w:eastAsia="Arial" w:hAnsi="Arial"/>
-                <w:sz w:val="20"/>
-                <w:szCs w:val="20"/>
-              </w:rPr>
-              <w:t xml:space="preserve">chr22:49043919–49052385</w:t>
-            </w:r>
-          </w:p>
-        </w:tc>
-      </w:tr>
-      <w:tr>
-        <w:tc>
-          <w:tcPr>
-            <w:tcW w:type="dxa" w:w="2800"/>
-            <w:tcBorders>
-              <w:top w:val="single" w:color="CCCCCC" w:sz="1"/>
-              <w:left w:val="single" w:color="CCCCCC" w:sz="1"/>
-              <w:bottom w:val="single" w:color="CCCCCC" w:sz="1"/>
-              <w:right w:val="single" w:color="CCCCCC" w:sz="1"/>
-            </w:tcBorders>
-            <w:shd w:fill="EEF4F9" w:val="clear"/>
-            <w:tcMar>
-              <w:top w:type="dxa" w:w="80"/>
-              <w:left w:type="dxa" w:w="120"/>
-              <w:bottom w:type="dxa" w:w="80"/>
-              <w:right w:type="dxa" w:w="120"/>
-            </w:tcMar>
-          </w:tcPr>
-          <w:p>
-            <w:r>
-              <w:rPr>
-                <w:rFonts w:ascii="Arial" w:cs="Arial" w:eastAsia="Arial" w:hAnsi="Arial"/>
-                <w:sz w:val="20"/>
-                <w:szCs w:val="20"/>
-              </w:rPr>
-              <w:t xml:space="preserve">MOFA+ Factor 3 hotspot</w:t>
-            </w:r>
-          </w:p>
-        </w:tc>
-        <w:tc>
-          <w:tcPr>
-            <w:tcW w:type="dxa" w:w="3280"/>
-            <w:tcBorders>
-              <w:top w:val="single" w:color="CCCCCC" w:sz="1"/>
-              <w:left w:val="single" w:color="CCCCCC" w:sz="1"/>
-              <w:bottom w:val="single" w:color="CCCCCC" w:sz="1"/>
-              <w:right w:val="single" w:color="CCCCCC" w:sz="1"/>
-            </w:tcBorders>
-            <w:shd w:fill="EEF4F9" w:val="clear"/>
-            <w:tcMar>
-              <w:top w:type="dxa" w:w="80"/>
-              <w:left w:type="dxa" w:w="120"/>
-              <w:bottom w:type="dxa" w:w="80"/>
-              <w:right w:type="dxa" w:w="120"/>
-            </w:tcMar>
-          </w:tcPr>
-          <w:p>
-            <w:r>
-              <w:rPr>
-                <w:rFonts w:ascii="Arial" w:cs="Arial" w:eastAsia="Arial" w:hAnsi="Arial"/>
-                <w:sz w:val="20"/>
-                <w:szCs w:val="20"/>
-              </w:rPr>
-              <w:t xml:space="preserve">chr10:2435505–2435579</w:t>
-            </w:r>
-          </w:p>
-        </w:tc>
-        <w:tc>
-          <w:tcPr>
-            <w:tcW w:type="dxa" w:w="3280"/>
-            <w:tcBorders>
-              <w:top w:val="single" w:color="CCCCCC" w:sz="1"/>
-              <w:left w:val="single" w:color="CCCCCC" w:sz="1"/>
-              <w:bottom w:val="single" w:color="CCCCCC" w:sz="1"/>
-              <w:right w:val="single" w:color="CCCCCC" w:sz="1"/>
-            </w:tcBorders>
-            <w:shd w:fill="EEF4F9" w:val="clear"/>
-            <w:tcMar>
-              <w:top w:type="dxa" w:w="80"/>
-              <w:left w:type="dxa" w:w="120"/>
-              <w:bottom w:type="dxa" w:w="80"/>
-              <w:right w:type="dxa" w:w="120"/>
-            </w:tcMar>
-          </w:tcPr>
-          <w:p>
-            <w:r>
-              <w:rPr>
-                <w:rFonts w:ascii="Arial" w:cs="Arial" w:eastAsia="Arial" w:hAnsi="Arial"/>
-                <w:sz w:val="20"/>
-                <w:szCs w:val="20"/>
-              </w:rPr>
-              <w:t xml:space="preserve">chr22:~49,047,163–49,047,237</w:t>
-            </w:r>
-          </w:p>
-        </w:tc>
-      </w:tr>
-      <w:tr>
-        <w:tc>
-          <w:tcPr>
-            <w:tcW w:type="dxa" w:w="2800"/>
-            <w:tcBorders>
-              <w:top w:val="single" w:color="CCCCCC" w:sz="1"/>
-              <w:left w:val="single" w:color="CCCCCC" w:sz="1"/>
-              <w:bottom w:val="single" w:color="CCCCCC" w:sz="1"/>
-              <w:right w:val="single" w:color="CCCCCC" w:sz="1"/>
-            </w:tcBorders>
-            <w:shd w:fill="FFFFFF" w:val="clear"/>
-            <w:tcMar>
-              <w:top w:type="dxa" w:w="80"/>
-              <w:left w:type="dxa" w:w="120"/>
-              <w:bottom w:type="dxa" w:w="80"/>
-              <w:right w:type="dxa" w:w="120"/>
-            </w:tcMar>
-          </w:tcPr>
-          <w:p>
-            <w:r>
-              <w:rPr>
-                <w:rFonts w:ascii="Arial" w:cs="Arial" w:eastAsia="Arial" w:hAnsi="Arial"/>
-                <w:sz w:val="20"/>
-                <w:szCs w:val="20"/>
-              </w:rPr>
-              <w:t xml:space="preserve">Window size</w:t>
-            </w:r>
-          </w:p>
-        </w:tc>
-        <w:tc>
-          <w:tcPr>
-            <w:tcW w:type="dxa" w:w="3280"/>
-            <w:tcBorders>
-              <w:top w:val="single" w:color="CCCCCC" w:sz="1"/>
-              <w:left w:val="single" w:color="CCCCCC" w:sz="1"/>
-              <w:bottom w:val="single" w:color="CCCCCC" w:sz="1"/>
-              <w:right w:val="single" w:color="CCCCCC" w:sz="1"/>
-            </w:tcBorders>
-            <w:shd w:fill="FFFFFF" w:val="clear"/>
-            <w:tcMar>
-              <w:top w:type="dxa" w:w="80"/>
-              <w:left w:type="dxa" w:w="120"/>
-              <w:bottom w:type="dxa" w:w="80"/>
-              <w:right w:type="dxa" w:w="120"/>
-            </w:tcMar>
-          </w:tcPr>
-          <w:p>
-            <w:r>
-              <w:rPr>
-                <w:rFonts w:ascii="Arial" w:cs="Arial" w:eastAsia="Arial" w:hAnsi="Arial"/>
-                <w:sz w:val="20"/>
-                <w:szCs w:val="20"/>
-              </w:rPr>
-              <w:t xml:space="preserve">74 bp</w:t>
-            </w:r>
-          </w:p>
-        </w:tc>
-        <w:tc>
-          <w:tcPr>
-            <w:tcW w:type="dxa" w:w="3280"/>
-            <w:tcBorders>
-              <w:top w:val="single" w:color="CCCCCC" w:sz="1"/>
-              <w:left w:val="single" w:color="CCCCCC" w:sz="1"/>
-              <w:bottom w:val="single" w:color="CCCCCC" w:sz="1"/>
-              <w:right w:val="single" w:color="CCCCCC" w:sz="1"/>
-            </w:tcBorders>
-            <w:shd w:fill="FFFFFF" w:val="clear"/>
-            <w:tcMar>
-              <w:top w:type="dxa" w:w="80"/>
-              <w:left w:type="dxa" w:w="120"/>
-              <w:bottom w:type="dxa" w:w="80"/>
-              <w:right w:type="dxa" w:w="120"/>
-            </w:tcMar>
-          </w:tcPr>
-          <w:p>
-            <w:r>
-              <w:rPr>
-                <w:rFonts w:ascii="Arial" w:cs="Arial" w:eastAsia="Arial" w:hAnsi="Arial"/>
-                <w:sz w:val="20"/>
-                <w:szCs w:val="20"/>
-              </w:rPr>
-              <w:t xml:space="preserve">~74 bp (approximate)</w:t>
-            </w:r>
-          </w:p>
-        </w:tc>
-      </w:tr>
-    </w:tbl>
-    <w:p>
-      <w:pPr>
-        <w:spacing w:after="60" w:before="60"/>
-      </w:pPr>
-      <w:r>
-        <w:t xml:space="preserve"/>
-      </w:r>
-    </w:p>
-    <w:p>
-      <w:pPr>
-        <w:spacing w:after="80" w:before="80"/>
-      </w:pPr>
-      <w:r>
-        <w:rPr>
-          <w:rFonts w:ascii="Arial" w:cs="Arial" w:eastAsia="Arial" w:hAnsi="Arial"/>
-          <w:sz w:val="22"/>
-          <w:szCs w:val="22"/>
-        </w:rPr>
-        <w:t xml:space="preserve">Inspection of the human equivalent coordinates in the UCSC Genome Browser (hg38) revealed the following annotations at the 74 bp hotspot:</w:t>
+        <w:t xml:space="preserve">MOFA+ Factor 3 top CpG weights cluster within a 74 bp window. Eight of the ten highest-weight CpGs fall at chr10:2435505–2435579 (macaque) / chr22:49,047,165–49,047,235 (hg38). Inspection of this window in the UCSC Genome Browser (hg38) revealed:</w:t>
       </w:r>
     </w:p>
     <w:p>
@@ -3058,7 +2655,7 @@
                 <w:sz w:val="20"/>
                 <w:szCs w:val="20"/>
               </w:rPr>
-              <w:t xml:space="preserve">Pink bar present — classified as an enhancer-like element (dELS or pELS). Functional regulatory annotation confirmed.</w:t>
+              <w:t xml:space="preserve">Pink bar — classified as an enhancer-like element (dELS/pELS)</w:t>
             </w:r>
           </w:p>
         </w:tc>
@@ -3116,7 +2713,7 @@
                 <w:sz w:val="20"/>
                 <w:szCs w:val="20"/>
               </w:rPr>
-              <w:t xml:space="preserve">Strong signal at top of scale across the region — active histone mark associated with regulatory activity in multiple cell lines.</w:t>
+              <w:t xml:space="preserve">Strong signal at top of scale — active histone mark across multiple ENCODE cell lines</w:t>
             </w:r>
           </w:p>
         </w:tc>
@@ -3174,7 +2771,7 @@
                 <w:sz w:val="20"/>
                 <w:szCs w:val="20"/>
               </w:rPr>
-              <w:t xml:space="preserve">No CpG island overlaps this specific 74 bp window.</w:t>
+              <w:t xml:space="preserve">No CpG island overlaps this 74 bp window</w:t>
             </w:r>
           </w:p>
         </w:tc>
@@ -3232,7 +2829,7 @@
                 <w:sz w:val="20"/>
                 <w:szCs w:val="20"/>
               </w:rPr>
-              <w:t xml:space="preserve">Mostly low or negative values — this region is not broadly conserved across vertebrates.</w:t>
+              <w:t xml:space="preserve">Mostly low or negative values — not broadly conserved across vertebrates; conserved in some mammals (dog, elephant) but not mouse or more distant species</w:t>
             </w:r>
           </w:p>
         </w:tc>
@@ -3262,7 +2859,7 @@
                 <w:sz w:val="20"/>
                 <w:szCs w:val="20"/>
               </w:rPr>
-              <w:t xml:space="preserve">Multiz Species Alignment</w:t>
+              <w:t xml:space="preserve">Hi-C (Micro-C)</w:t>
             </w:r>
           </w:p>
         </w:tc>
@@ -3290,7 +2887,181 @@
                 <w:sz w:val="20"/>
                 <w:szCs w:val="20"/>
               </w:rPr>
-              <w:t xml:space="preserve">Three species show identical sequence to human (= signs). Rhesus is highly similar. Mouse, Chicken, and X_tropicalis show divergent sequence.</w:t>
+              <w:t xml:space="preserve">Large chromatin interaction peak spanning the region — consistent with active enhancer looping to target promoter</w:t>
+            </w:r>
+          </w:p>
+        </w:tc>
+      </w:tr>
+      <w:tr>
+        <w:tc>
+          <w:tcPr>
+            <w:tcW w:type="dxa" w:w="2800"/>
+            <w:tcBorders>
+              <w:top w:val="single" w:color="CCCCCC" w:sz="1"/>
+              <w:left w:val="single" w:color="CCCCCC" w:sz="1"/>
+              <w:bottom w:val="single" w:color="CCCCCC" w:sz="1"/>
+              <w:right w:val="single" w:color="CCCCCC" w:sz="1"/>
+            </w:tcBorders>
+            <w:shd w:fill="EEF4F9" w:val="clear"/>
+            <w:tcMar>
+              <w:top w:type="dxa" w:w="80"/>
+              <w:left w:type="dxa" w:w="120"/>
+              <w:bottom w:type="dxa" w:w="80"/>
+              <w:right w:type="dxa" w:w="120"/>
+            </w:tcMar>
+          </w:tcPr>
+          <w:p>
+            <w:r>
+              <w:rPr>
+                <w:rFonts w:ascii="Arial" w:cs="Arial" w:eastAsia="Arial" w:hAnsi="Arial"/>
+                <w:sz w:val="20"/>
+                <w:szCs w:val="20"/>
+              </w:rPr>
+              <w:t xml:space="preserve">ReMap density</w:t>
+            </w:r>
+          </w:p>
+        </w:tc>
+        <w:tc>
+          <w:tcPr>
+            <w:tcW w:type="dxa" w:w="6560"/>
+            <w:tcBorders>
+              <w:top w:val="single" w:color="CCCCCC" w:sz="1"/>
+              <w:left w:val="single" w:color="CCCCCC" w:sz="1"/>
+              <w:bottom w:val="single" w:color="CCCCCC" w:sz="1"/>
+              <w:right w:val="single" w:color="CCCCCC" w:sz="1"/>
+            </w:tcBorders>
+            <w:shd w:fill="EEF4F9" w:val="clear"/>
+            <w:tcMar>
+              <w:top w:type="dxa" w:w="80"/>
+              <w:left w:type="dxa" w:w="120"/>
+              <w:bottom w:type="dxa" w:w="80"/>
+              <w:right w:type="dxa" w:w="120"/>
+            </w:tcMar>
+          </w:tcPr>
+          <w:p>
+            <w:r>
+              <w:rPr>
+                <w:rFonts w:ascii="Arial" w:cs="Arial" w:eastAsia="Arial" w:hAnsi="Arial"/>
+                <w:sz w:val="20"/>
+                <w:szCs w:val="20"/>
+              </w:rPr>
+              <w:t xml:space="preserve">Density of 18 at the left edge of the window decreasing to 11–12 toward the right — indicating concentrated transcription factor binding at the 5' end of the hotspot</w:t>
+            </w:r>
+          </w:p>
+        </w:tc>
+      </w:tr>
+      <w:tr>
+        <w:tc>
+          <w:tcPr>
+            <w:tcW w:type="dxa" w:w="2800"/>
+            <w:tcBorders>
+              <w:top w:val="single" w:color="CCCCCC" w:sz="1"/>
+              <w:left w:val="single" w:color="CCCCCC" w:sz="1"/>
+              <w:bottom w:val="single" w:color="CCCCCC" w:sz="1"/>
+              <w:right w:val="single" w:color="CCCCCC" w:sz="1"/>
+            </w:tcBorders>
+            <w:shd w:fill="FFFFFF" w:val="clear"/>
+            <w:tcMar>
+              <w:top w:type="dxa" w:w="80"/>
+              <w:left w:type="dxa" w:w="120"/>
+              <w:bottom w:type="dxa" w:w="80"/>
+              <w:right w:type="dxa" w:w="120"/>
+            </w:tcMar>
+          </w:tcPr>
+          <w:p>
+            <w:r>
+              <w:rPr>
+                <w:rFonts w:ascii="Arial" w:cs="Arial" w:eastAsia="Arial" w:hAnsi="Arial"/>
+                <w:sz w:val="20"/>
+                <w:szCs w:val="20"/>
+              </w:rPr>
+              <w:t xml:space="preserve">ReMap TFs identified</w:t>
+            </w:r>
+          </w:p>
+        </w:tc>
+        <w:tc>
+          <w:tcPr>
+            <w:tcW w:type="dxa" w:w="6560"/>
+            <w:tcBorders>
+              <w:top w:val="single" w:color="CCCCCC" w:sz="1"/>
+              <w:left w:val="single" w:color="CCCCCC" w:sz="1"/>
+              <w:bottom w:val="single" w:color="CCCCCC" w:sz="1"/>
+              <w:right w:val="single" w:color="CCCCCC" w:sz="1"/>
+            </w:tcBorders>
+            <w:shd w:fill="FFFFFF" w:val="clear"/>
+            <w:tcMar>
+              <w:top w:type="dxa" w:w="80"/>
+              <w:left w:type="dxa" w:w="120"/>
+              <w:bottom w:type="dxa" w:w="80"/>
+              <w:right w:type="dxa" w:w="120"/>
+            </w:tcMar>
+          </w:tcPr>
+          <w:p>
+            <w:r>
+              <w:rPr>
+                <w:rFonts w:ascii="Arial" w:cs="Arial" w:eastAsia="Arial" w:hAnsi="Arial"/>
+                <w:sz w:val="20"/>
+                <w:szCs w:val="20"/>
+              </w:rPr>
+              <w:t xml:space="preserve">EZH2 (repressive PRC2 mark writer), SMC1/cohesin (chromatin loop organiser), JUN (AP-1 stress-responsive TF), ZFP36 (stress/inflammation), LYN (immune signalling)</w:t>
+            </w:r>
+          </w:p>
+        </w:tc>
+      </w:tr>
+      <w:tr>
+        <w:tc>
+          <w:tcPr>
+            <w:tcW w:type="dxa" w:w="2800"/>
+            <w:tcBorders>
+              <w:top w:val="single" w:color="CCCCCC" w:sz="1"/>
+              <w:left w:val="single" w:color="CCCCCC" w:sz="1"/>
+              <w:bottom w:val="single" w:color="CCCCCC" w:sz="1"/>
+              <w:right w:val="single" w:color="CCCCCC" w:sz="1"/>
+            </w:tcBorders>
+            <w:shd w:fill="EEF4F9" w:val="clear"/>
+            <w:tcMar>
+              <w:top w:type="dxa" w:w="80"/>
+              <w:left w:type="dxa" w:w="120"/>
+              <w:bottom w:type="dxa" w:w="80"/>
+              <w:right w:type="dxa" w:w="120"/>
+            </w:tcMar>
+          </w:tcPr>
+          <w:p>
+            <w:r>
+              <w:rPr>
+                <w:rFonts w:ascii="Arial" w:cs="Arial" w:eastAsia="Arial" w:hAnsi="Arial"/>
+                <w:sz w:val="20"/>
+                <w:szCs w:val="20"/>
+              </w:rPr>
+              <w:t xml:space="preserve">WGBS (multiple tissues)</w:t>
+            </w:r>
+          </w:p>
+        </w:tc>
+        <w:tc>
+          <w:tcPr>
+            <w:tcW w:type="dxa" w:w="6560"/>
+            <w:tcBorders>
+              <w:top w:val="single" w:color="CCCCCC" w:sz="1"/>
+              <w:left w:val="single" w:color="CCCCCC" w:sz="1"/>
+              <w:bottom w:val="single" w:color="CCCCCC" w:sz="1"/>
+              <w:right w:val="single" w:color="CCCCCC" w:sz="1"/>
+            </w:tcBorders>
+            <w:shd w:fill="EEF4F9" w:val="clear"/>
+            <w:tcMar>
+              <w:top w:type="dxa" w:w="80"/>
+              <w:left w:type="dxa" w:w="120"/>
+              <w:bottom w:type="dxa" w:w="80"/>
+              <w:right w:type="dxa" w:w="120"/>
+            </w:tcMar>
+          </w:tcPr>
+          <w:p>
+            <w:r>
+              <w:rPr>
+                <w:rFonts w:ascii="Arial" w:cs="Arial" w:eastAsia="Arial" w:hAnsi="Arial"/>
+                <w:sz w:val="20"/>
+                <w:szCs w:val="20"/>
+              </w:rPr>
+              <w:t xml:space="preserve">Region is unmethylated across neurons, cardiomyocytes, blood cells, lung, liver, and colon — consistent with constitutively open regulatory element under baseline conditions</w:t>
             </w:r>
           </w:p>
         </w:tc>
@@ -3306,17 +3077,705 @@
     </w:p>
     <w:p>
       <w:pPr>
+        <w:pStyle w:val="Heading2"/>
+      </w:pPr>
+      <w:r>
+        <w:t xml:space="preserve">4.3 Direction of Methylation Change at the Hotspot</w:t>
+      </w:r>
+    </w:p>
+    <w:p>
+      <w:pPr>
         <w:spacing w:after="80" w:before="80"/>
       </w:pPr>
       <w:r>
         <w:rPr>
           <w:rFonts w:ascii="Arial" w:cs="Arial" w:eastAsia="Arial" w:hAnsi="Arial"/>
-          <w:i w:val="false"/>
-          <w:iCs w:val="false"/>
           <w:sz w:val="22"/>
           <w:szCs w:val="22"/>
         </w:rPr>
-        <w:t xml:space="preserve">The combination of an ENCODE4 cCRE classification and strong H3K27Ac signal identifies this 74 bp window as an active regulatory element — likely an enhancer — embedded within the gene body. Methylation changes at this element, consistently observed across wildfire, stress, obesity, and cfDNA cohorts, suggest that early-life adversity may modulate the activity of this regulatory element regardless of exposure type.</w:t>
+        <w:t xml:space="preserve">Per-cohort delta beta (case − control) was examined for all 8 hotspot CpGs across all 9 datasets:</w:t>
+      </w:r>
+    </w:p>
+    <w:p>
+      <w:pPr>
+        <w:spacing w:after="60" w:before="60"/>
+      </w:pPr>
+      <w:r>
+        <w:t xml:space="preserve"/>
+      </w:r>
+    </w:p>
+    <w:tbl>
+      <w:tblPr>
+        <w:tblW w:type="dxa" w:w="9360"/>
+        <w:tblBorders>
+          <w:top w:val="single" w:color="auto" w:sz="4"/>
+          <w:left w:val="single" w:color="auto" w:sz="4"/>
+          <w:bottom w:val="single" w:color="auto" w:sz="4"/>
+          <w:right w:val="single" w:color="auto" w:sz="4"/>
+          <w:insideH w:val="single" w:color="auto" w:sz="4"/>
+          <w:insideV w:val="single" w:color="auto" w:sz="4"/>
+        </w:tblBorders>
+      </w:tblPr>
+      <w:tblGrid>
+        <w:gridCol w:w="2800"/>
+        <w:gridCol w:w="1800"/>
+        <w:gridCol w:w="4760"/>
+      </w:tblGrid>
+      <w:tr>
+        <w:trPr>
+          <w:tblHeader/>
+        </w:trPr>
+        <w:tc>
+          <w:tcPr>
+            <w:tcW w:type="dxa" w:w="2800"/>
+            <w:tcBorders>
+              <w:top w:val="single" w:color="CCCCCC" w:sz="1"/>
+              <w:left w:val="single" w:color="CCCCCC" w:sz="1"/>
+              <w:bottom w:val="single" w:color="CCCCCC" w:sz="1"/>
+              <w:right w:val="single" w:color="CCCCCC" w:sz="1"/>
+            </w:tcBorders>
+            <w:shd w:fill="2C5F8A" w:val="clear"/>
+            <w:tcMar>
+              <w:top w:type="dxa" w:w="80"/>
+              <w:left w:type="dxa" w:w="120"/>
+              <w:bottom w:type="dxa" w:w="80"/>
+              <w:right w:type="dxa" w:w="120"/>
+            </w:tcMar>
+          </w:tcPr>
+          <w:p>
+            <w:r>
+              <w:rPr>
+                <w:rFonts w:ascii="Arial" w:cs="Arial" w:eastAsia="Arial" w:hAnsi="Arial"/>
+                <w:b/>
+                <w:bCs/>
+                <w:color w:val="FFFFFF"/>
+                <w:sz w:val="20"/>
+                <w:szCs w:val="20"/>
+              </w:rPr>
+              <w:t xml:space="preserve">Cohort</w:t>
+            </w:r>
+          </w:p>
+        </w:tc>
+        <w:tc>
+          <w:tcPr>
+            <w:tcW w:type="dxa" w:w="1800"/>
+            <w:tcBorders>
+              <w:top w:val="single" w:color="CCCCCC" w:sz="1"/>
+              <w:left w:val="single" w:color="CCCCCC" w:sz="1"/>
+              <w:bottom w:val="single" w:color="CCCCCC" w:sz="1"/>
+              <w:right w:val="single" w:color="CCCCCC" w:sz="1"/>
+            </w:tcBorders>
+            <w:shd w:fill="2C5F8A" w:val="clear"/>
+            <w:tcMar>
+              <w:top w:type="dxa" w:w="80"/>
+              <w:left w:type="dxa" w:w="120"/>
+              <w:bottom w:type="dxa" w:w="80"/>
+              <w:right w:type="dxa" w:w="120"/>
+            </w:tcMar>
+          </w:tcPr>
+          <w:p>
+            <w:r>
+              <w:rPr>
+                <w:rFonts w:ascii="Arial" w:cs="Arial" w:eastAsia="Arial" w:hAnsi="Arial"/>
+                <w:b/>
+                <w:bCs/>
+                <w:color w:val="FFFFFF"/>
+                <w:sz w:val="20"/>
+                <w:szCs w:val="20"/>
+              </w:rPr>
+              <w:t xml:space="preserve">Direction</w:t>
+            </w:r>
+          </w:p>
+        </w:tc>
+        <w:tc>
+          <w:tcPr>
+            <w:tcW w:type="dxa" w:w="4760"/>
+            <w:tcBorders>
+              <w:top w:val="single" w:color="CCCCCC" w:sz="1"/>
+              <w:left w:val="single" w:color="CCCCCC" w:sz="1"/>
+              <w:bottom w:val="single" w:color="CCCCCC" w:sz="1"/>
+              <w:right w:val="single" w:color="CCCCCC" w:sz="1"/>
+            </w:tcBorders>
+            <w:shd w:fill="2C5F8A" w:val="clear"/>
+            <w:tcMar>
+              <w:top w:type="dxa" w:w="80"/>
+              <w:left w:type="dxa" w:w="120"/>
+              <w:bottom w:type="dxa" w:w="80"/>
+              <w:right w:type="dxa" w:w="120"/>
+            </w:tcMar>
+          </w:tcPr>
+          <w:p>
+            <w:r>
+              <w:rPr>
+                <w:rFonts w:ascii="Arial" w:cs="Arial" w:eastAsia="Arial" w:hAnsi="Arial"/>
+                <w:b/>
+                <w:bCs/>
+                <w:color w:val="FFFFFF"/>
+                <w:sz w:val="20"/>
+                <w:szCs w:val="20"/>
+              </w:rPr>
+              <w:t xml:space="preserve">Notes</w:t>
+            </w:r>
+          </w:p>
+        </w:tc>
+      </w:tr>
+      <w:tr>
+        <w:tc>
+          <w:tcPr>
+            <w:tcW w:type="dxa" w:w="2800"/>
+            <w:tcBorders>
+              <w:top w:val="single" w:color="CCCCCC" w:sz="1"/>
+              <w:left w:val="single" w:color="CCCCCC" w:sz="1"/>
+              <w:bottom w:val="single" w:color="CCCCCC" w:sz="1"/>
+              <w:right w:val="single" w:color="CCCCCC" w:sz="1"/>
+            </w:tcBorders>
+            <w:shd w:fill="FFFFFF" w:val="clear"/>
+            <w:tcMar>
+              <w:top w:type="dxa" w:w="80"/>
+              <w:left w:type="dxa" w:w="120"/>
+              <w:bottom w:type="dxa" w:w="80"/>
+              <w:right w:type="dxa" w:w="120"/>
+            </w:tcMar>
+          </w:tcPr>
+          <w:p>
+            <w:r>
+              <w:rPr>
+                <w:rFonts w:ascii="Arial" w:cs="Arial" w:eastAsia="Arial" w:hAnsi="Arial"/>
+                <w:sz w:val="20"/>
+                <w:szCs w:val="20"/>
+              </w:rPr>
+              <w:t xml:space="preserve">stress (n=76)</w:t>
+            </w:r>
+          </w:p>
+        </w:tc>
+        <w:tc>
+          <w:tcPr>
+            <w:tcW w:type="dxa" w:w="1800"/>
+            <w:tcBorders>
+              <w:top w:val="single" w:color="CCCCCC" w:sz="1"/>
+              <w:left w:val="single" w:color="CCCCCC" w:sz="1"/>
+              <w:bottom w:val="single" w:color="CCCCCC" w:sz="1"/>
+              <w:right w:val="single" w:color="CCCCCC" w:sz="1"/>
+            </w:tcBorders>
+            <w:shd w:fill="FFFFFF" w:val="clear"/>
+            <w:tcMar>
+              <w:top w:type="dxa" w:w="80"/>
+              <w:left w:type="dxa" w:w="120"/>
+              <w:bottom w:type="dxa" w:w="80"/>
+              <w:right w:type="dxa" w:w="120"/>
+            </w:tcMar>
+          </w:tcPr>
+          <w:p>
+            <w:r>
+              <w:rPr>
+                <w:rFonts w:ascii="Arial" w:cs="Arial" w:eastAsia="Arial" w:hAnsi="Arial"/>
+                <w:sz w:val="20"/>
+                <w:szCs w:val="20"/>
+              </w:rPr>
+              <w:t xml:space="preserve">Hypomethylated</w:t>
+            </w:r>
+          </w:p>
+        </w:tc>
+        <w:tc>
+          <w:tcPr>
+            <w:tcW w:type="dxa" w:w="4760"/>
+            <w:tcBorders>
+              <w:top w:val="single" w:color="CCCCCC" w:sz="1"/>
+              <w:left w:val="single" w:color="CCCCCC" w:sz="1"/>
+              <w:bottom w:val="single" w:color="CCCCCC" w:sz="1"/>
+              <w:right w:val="single" w:color="CCCCCC" w:sz="1"/>
+            </w:tcBorders>
+            <w:shd w:fill="FFFFFF" w:val="clear"/>
+            <w:tcMar>
+              <w:top w:type="dxa" w:w="80"/>
+              <w:left w:type="dxa" w:w="120"/>
+              <w:bottom w:type="dxa" w:w="80"/>
+              <w:right w:type="dxa" w:w="120"/>
+            </w:tcMar>
+          </w:tcPr>
+          <w:p>
+            <w:r>
+              <w:rPr>
+                <w:rFonts w:ascii="Arial" w:cs="Arial" w:eastAsia="Arial" w:hAnsi="Arial"/>
+                <w:sz w:val="20"/>
+                <w:szCs w:val="20"/>
+              </w:rPr>
+              <w:t xml:space="preserve">6/8 CpGs show negative delta beta in cases</w:t>
+            </w:r>
+          </w:p>
+        </w:tc>
+      </w:tr>
+      <w:tr>
+        <w:tc>
+          <w:tcPr>
+            <w:tcW w:type="dxa" w:w="2800"/>
+            <w:tcBorders>
+              <w:top w:val="single" w:color="CCCCCC" w:sz="1"/>
+              <w:left w:val="single" w:color="CCCCCC" w:sz="1"/>
+              <w:bottom w:val="single" w:color="CCCCCC" w:sz="1"/>
+              <w:right w:val="single" w:color="CCCCCC" w:sz="1"/>
+            </w:tcBorders>
+            <w:shd w:fill="EEF4F9" w:val="clear"/>
+            <w:tcMar>
+              <w:top w:type="dxa" w:w="80"/>
+              <w:left w:type="dxa" w:w="120"/>
+              <w:bottom w:type="dxa" w:w="80"/>
+              <w:right w:type="dxa" w:w="120"/>
+            </w:tcMar>
+          </w:tcPr>
+          <w:p>
+            <w:r>
+              <w:rPr>
+                <w:rFonts w:ascii="Arial" w:cs="Arial" w:eastAsia="Arial" w:hAnsi="Arial"/>
+                <w:sz w:val="20"/>
+                <w:szCs w:val="20"/>
+              </w:rPr>
+              <w:t xml:space="preserve">obesity_prefrontalcortex</w:t>
+            </w:r>
+          </w:p>
+        </w:tc>
+        <w:tc>
+          <w:tcPr>
+            <w:tcW w:type="dxa" w:w="1800"/>
+            <w:tcBorders>
+              <w:top w:val="single" w:color="CCCCCC" w:sz="1"/>
+              <w:left w:val="single" w:color="CCCCCC" w:sz="1"/>
+              <w:bottom w:val="single" w:color="CCCCCC" w:sz="1"/>
+              <w:right w:val="single" w:color="CCCCCC" w:sz="1"/>
+            </w:tcBorders>
+            <w:shd w:fill="EEF4F9" w:val="clear"/>
+            <w:tcMar>
+              <w:top w:type="dxa" w:w="80"/>
+              <w:left w:type="dxa" w:w="120"/>
+              <w:bottom w:type="dxa" w:w="80"/>
+              <w:right w:type="dxa" w:w="120"/>
+            </w:tcMar>
+          </w:tcPr>
+          <w:p>
+            <w:r>
+              <w:rPr>
+                <w:rFonts w:ascii="Arial" w:cs="Arial" w:eastAsia="Arial" w:hAnsi="Arial"/>
+                <w:sz w:val="20"/>
+                <w:szCs w:val="20"/>
+              </w:rPr>
+              <w:t xml:space="preserve">Hypomethylated</w:t>
+            </w:r>
+          </w:p>
+        </w:tc>
+        <w:tc>
+          <w:tcPr>
+            <w:tcW w:type="dxa" w:w="4760"/>
+            <w:tcBorders>
+              <w:top w:val="single" w:color="CCCCCC" w:sz="1"/>
+              <w:left w:val="single" w:color="CCCCCC" w:sz="1"/>
+              <w:bottom w:val="single" w:color="CCCCCC" w:sz="1"/>
+              <w:right w:val="single" w:color="CCCCCC" w:sz="1"/>
+            </w:tcBorders>
+            <w:shd w:fill="EEF4F9" w:val="clear"/>
+            <w:tcMar>
+              <w:top w:type="dxa" w:w="80"/>
+              <w:left w:type="dxa" w:w="120"/>
+              <w:bottom w:type="dxa" w:w="80"/>
+              <w:right w:type="dxa" w:w="120"/>
+            </w:tcMar>
+          </w:tcPr>
+          <w:p>
+            <w:r>
+              <w:rPr>
+                <w:rFonts w:ascii="Arial" w:cs="Arial" w:eastAsia="Arial" w:hAnsi="Arial"/>
+                <w:sz w:val="20"/>
+                <w:szCs w:val="20"/>
+              </w:rPr>
+              <w:t xml:space="preserve">7/8 CpGs show negative delta beta in cases</w:t>
+            </w:r>
+          </w:p>
+        </w:tc>
+      </w:tr>
+      <w:tr>
+        <w:tc>
+          <w:tcPr>
+            <w:tcW w:type="dxa" w:w="2800"/>
+            <w:tcBorders>
+              <w:top w:val="single" w:color="CCCCCC" w:sz="1"/>
+              <w:left w:val="single" w:color="CCCCCC" w:sz="1"/>
+              <w:bottom w:val="single" w:color="CCCCCC" w:sz="1"/>
+              <w:right w:val="single" w:color="CCCCCC" w:sz="1"/>
+            </w:tcBorders>
+            <w:shd w:fill="FFFFFF" w:val="clear"/>
+            <w:tcMar>
+              <w:top w:type="dxa" w:w="80"/>
+              <w:left w:type="dxa" w:w="120"/>
+              <w:bottom w:type="dxa" w:w="80"/>
+              <w:right w:type="dxa" w:w="120"/>
+            </w:tcMar>
+          </w:tcPr>
+          <w:p>
+            <w:r>
+              <w:rPr>
+                <w:rFonts w:ascii="Arial" w:cs="Arial" w:eastAsia="Arial" w:hAnsi="Arial"/>
+                <w:sz w:val="20"/>
+                <w:szCs w:val="20"/>
+              </w:rPr>
+              <w:t xml:space="preserve">obesity_hippocampus</w:t>
+            </w:r>
+          </w:p>
+        </w:tc>
+        <w:tc>
+          <w:tcPr>
+            <w:tcW w:type="dxa" w:w="1800"/>
+            <w:tcBorders>
+              <w:top w:val="single" w:color="CCCCCC" w:sz="1"/>
+              <w:left w:val="single" w:color="CCCCCC" w:sz="1"/>
+              <w:bottom w:val="single" w:color="CCCCCC" w:sz="1"/>
+              <w:right w:val="single" w:color="CCCCCC" w:sz="1"/>
+            </w:tcBorders>
+            <w:shd w:fill="FFFFFF" w:val="clear"/>
+            <w:tcMar>
+              <w:top w:type="dxa" w:w="80"/>
+              <w:left w:type="dxa" w:w="120"/>
+              <w:bottom w:type="dxa" w:w="80"/>
+              <w:right w:type="dxa" w:w="120"/>
+            </w:tcMar>
+          </w:tcPr>
+          <w:p>
+            <w:r>
+              <w:rPr>
+                <w:rFonts w:ascii="Arial" w:cs="Arial" w:eastAsia="Arial" w:hAnsi="Arial"/>
+                <w:sz w:val="20"/>
+                <w:szCs w:val="20"/>
+              </w:rPr>
+              <w:t xml:space="preserve">Hypomethylated</w:t>
+            </w:r>
+          </w:p>
+        </w:tc>
+        <w:tc>
+          <w:tcPr>
+            <w:tcW w:type="dxa" w:w="4760"/>
+            <w:tcBorders>
+              <w:top w:val="single" w:color="CCCCCC" w:sz="1"/>
+              <w:left w:val="single" w:color="CCCCCC" w:sz="1"/>
+              <w:bottom w:val="single" w:color="CCCCCC" w:sz="1"/>
+              <w:right w:val="single" w:color="CCCCCC" w:sz="1"/>
+            </w:tcBorders>
+            <w:shd w:fill="FFFFFF" w:val="clear"/>
+            <w:tcMar>
+              <w:top w:type="dxa" w:w="80"/>
+              <w:left w:type="dxa" w:w="120"/>
+              <w:bottom w:type="dxa" w:w="80"/>
+              <w:right w:type="dxa" w:w="120"/>
+            </w:tcMar>
+          </w:tcPr>
+          <w:p>
+            <w:r>
+              <w:rPr>
+                <w:rFonts w:ascii="Arial" w:cs="Arial" w:eastAsia="Arial" w:hAnsi="Arial"/>
+                <w:sz w:val="20"/>
+                <w:szCs w:val="20"/>
+              </w:rPr>
+              <w:t xml:space="preserve">Mostly negative delta beta in cases</w:t>
+            </w:r>
+          </w:p>
+        </w:tc>
+      </w:tr>
+      <w:tr>
+        <w:tc>
+          <w:tcPr>
+            <w:tcW w:type="dxa" w:w="2800"/>
+            <w:tcBorders>
+              <w:top w:val="single" w:color="CCCCCC" w:sz="1"/>
+              <w:left w:val="single" w:color="CCCCCC" w:sz="1"/>
+              <w:bottom w:val="single" w:color="CCCCCC" w:sz="1"/>
+              <w:right w:val="single" w:color="CCCCCC" w:sz="1"/>
+            </w:tcBorders>
+            <w:shd w:fill="EEF4F9" w:val="clear"/>
+            <w:tcMar>
+              <w:top w:type="dxa" w:w="80"/>
+              <w:left w:type="dxa" w:w="120"/>
+              <w:bottom w:type="dxa" w:w="80"/>
+              <w:right w:type="dxa" w:w="120"/>
+            </w:tcMar>
+          </w:tcPr>
+          <w:p>
+            <w:r>
+              <w:rPr>
+                <w:rFonts w:ascii="Arial" w:cs="Arial" w:eastAsia="Arial" w:hAnsi="Arial"/>
+                <w:sz w:val="20"/>
+                <w:szCs w:val="20"/>
+              </w:rPr>
+              <w:t xml:space="preserve">cfdna_GD120</w:t>
+            </w:r>
+          </w:p>
+        </w:tc>
+        <w:tc>
+          <w:tcPr>
+            <w:tcW w:type="dxa" w:w="1800"/>
+            <w:tcBorders>
+              <w:top w:val="single" w:color="CCCCCC" w:sz="1"/>
+              <w:left w:val="single" w:color="CCCCCC" w:sz="1"/>
+              <w:bottom w:val="single" w:color="CCCCCC" w:sz="1"/>
+              <w:right w:val="single" w:color="CCCCCC" w:sz="1"/>
+            </w:tcBorders>
+            <w:shd w:fill="EEF4F9" w:val="clear"/>
+            <w:tcMar>
+              <w:top w:type="dxa" w:w="80"/>
+              <w:left w:type="dxa" w:w="120"/>
+              <w:bottom w:type="dxa" w:w="80"/>
+              <w:right w:type="dxa" w:w="120"/>
+            </w:tcMar>
+          </w:tcPr>
+          <w:p>
+            <w:r>
+              <w:rPr>
+                <w:rFonts w:ascii="Arial" w:cs="Arial" w:eastAsia="Arial" w:hAnsi="Arial"/>
+                <w:sz w:val="20"/>
+                <w:szCs w:val="20"/>
+              </w:rPr>
+              <w:t xml:space="preserve">Hypomethylated</w:t>
+            </w:r>
+          </w:p>
+        </w:tc>
+        <w:tc>
+          <w:tcPr>
+            <w:tcW w:type="dxa" w:w="4760"/>
+            <w:tcBorders>
+              <w:top w:val="single" w:color="CCCCCC" w:sz="1"/>
+              <w:left w:val="single" w:color="CCCCCC" w:sz="1"/>
+              <w:bottom w:val="single" w:color="CCCCCC" w:sz="1"/>
+              <w:right w:val="single" w:color="CCCCCC" w:sz="1"/>
+            </w:tcBorders>
+            <w:shd w:fill="EEF4F9" w:val="clear"/>
+            <w:tcMar>
+              <w:top w:type="dxa" w:w="80"/>
+              <w:left w:type="dxa" w:w="120"/>
+              <w:bottom w:type="dxa" w:w="80"/>
+              <w:right w:type="dxa" w:w="120"/>
+            </w:tcMar>
+          </w:tcPr>
+          <w:p>
+            <w:r>
+              <w:rPr>
+                <w:rFonts w:ascii="Arial" w:cs="Arial" w:eastAsia="Arial" w:hAnsi="Arial"/>
+                <w:sz w:val="20"/>
+                <w:szCs w:val="20"/>
+              </w:rPr>
+              <w:t xml:space="preserve">Mostly negative delta beta in cases</w:t>
+            </w:r>
+          </w:p>
+        </w:tc>
+      </w:tr>
+      <w:tr>
+        <w:tc>
+          <w:tcPr>
+            <w:tcW w:type="dxa" w:w="2800"/>
+            <w:tcBorders>
+              <w:top w:val="single" w:color="CCCCCC" w:sz="1"/>
+              <w:left w:val="single" w:color="CCCCCC" w:sz="1"/>
+              <w:bottom w:val="single" w:color="CCCCCC" w:sz="1"/>
+              <w:right w:val="single" w:color="CCCCCC" w:sz="1"/>
+            </w:tcBorders>
+            <w:shd w:fill="FFFFFF" w:val="clear"/>
+            <w:tcMar>
+              <w:top w:type="dxa" w:w="80"/>
+              <w:left w:type="dxa" w:w="120"/>
+              <w:bottom w:type="dxa" w:w="80"/>
+              <w:right w:type="dxa" w:w="120"/>
+            </w:tcMar>
+          </w:tcPr>
+          <w:p>
+            <w:r>
+              <w:rPr>
+                <w:rFonts w:ascii="Arial" w:cs="Arial" w:eastAsia="Arial" w:hAnsi="Arial"/>
+                <w:sz w:val="20"/>
+                <w:szCs w:val="20"/>
+              </w:rPr>
+              <w:t xml:space="preserve">wildfire, obesity_hypothalamus, cfdna_GD45, cfdna_GD90</w:t>
+            </w:r>
+          </w:p>
+        </w:tc>
+        <w:tc>
+          <w:tcPr>
+            <w:tcW w:type="dxa" w:w="1800"/>
+            <w:tcBorders>
+              <w:top w:val="single" w:color="CCCCCC" w:sz="1"/>
+              <w:left w:val="single" w:color="CCCCCC" w:sz="1"/>
+              <w:bottom w:val="single" w:color="CCCCCC" w:sz="1"/>
+              <w:right w:val="single" w:color="CCCCCC" w:sz="1"/>
+            </w:tcBorders>
+            <w:shd w:fill="FFFFFF" w:val="clear"/>
+            <w:tcMar>
+              <w:top w:type="dxa" w:w="80"/>
+              <w:left w:type="dxa" w:w="120"/>
+              <w:bottom w:type="dxa" w:w="80"/>
+              <w:right w:type="dxa" w:w="120"/>
+            </w:tcMar>
+          </w:tcPr>
+          <w:p>
+            <w:r>
+              <w:rPr>
+                <w:rFonts w:ascii="Arial" w:cs="Arial" w:eastAsia="Arial" w:hAnsi="Arial"/>
+                <w:sz w:val="20"/>
+                <w:szCs w:val="20"/>
+              </w:rPr>
+              <w:t xml:space="preserve">Mixed</w:t>
+            </w:r>
+          </w:p>
+        </w:tc>
+        <w:tc>
+          <w:tcPr>
+            <w:tcW w:type="dxa" w:w="4760"/>
+            <w:tcBorders>
+              <w:top w:val="single" w:color="CCCCCC" w:sz="1"/>
+              <w:left w:val="single" w:color="CCCCCC" w:sz="1"/>
+              <w:bottom w:val="single" w:color="CCCCCC" w:sz="1"/>
+              <w:right w:val="single" w:color="CCCCCC" w:sz="1"/>
+            </w:tcBorders>
+            <w:shd w:fill="FFFFFF" w:val="clear"/>
+            <w:tcMar>
+              <w:top w:type="dxa" w:w="80"/>
+              <w:left w:type="dxa" w:w="120"/>
+              <w:bottom w:type="dxa" w:w="80"/>
+              <w:right w:type="dxa" w:w="120"/>
+            </w:tcMar>
+          </w:tcPr>
+          <w:p>
+            <w:r>
+              <w:rPr>
+                <w:rFonts w:ascii="Arial" w:cs="Arial" w:eastAsia="Arial" w:hAnsi="Arial"/>
+                <w:sz w:val="20"/>
+                <w:szCs w:val="20"/>
+              </w:rPr>
+              <w:t xml:space="preserve">No consistent direction across CpGs</w:t>
+            </w:r>
+          </w:p>
+        </w:tc>
+      </w:tr>
+      <w:tr>
+        <w:tc>
+          <w:tcPr>
+            <w:tcW w:type="dxa" w:w="2800"/>
+            <w:tcBorders>
+              <w:top w:val="single" w:color="CCCCCC" w:sz="1"/>
+              <w:left w:val="single" w:color="CCCCCC" w:sz="1"/>
+              <w:bottom w:val="single" w:color="CCCCCC" w:sz="1"/>
+              <w:right w:val="single" w:color="CCCCCC" w:sz="1"/>
+            </w:tcBorders>
+            <w:shd w:fill="EEF4F9" w:val="clear"/>
+            <w:tcMar>
+              <w:top w:type="dxa" w:w="80"/>
+              <w:left w:type="dxa" w:w="120"/>
+              <w:bottom w:type="dxa" w:w="80"/>
+              <w:right w:type="dxa" w:w="120"/>
+            </w:tcMar>
+          </w:tcPr>
+          <w:p>
+            <w:r>
+              <w:rPr>
+                <w:rFonts w:ascii="Arial" w:cs="Arial" w:eastAsia="Arial" w:hAnsi="Arial"/>
+                <w:sz w:val="20"/>
+                <w:szCs w:val="20"/>
+              </w:rPr>
+              <w:t xml:space="preserve">cfdna_GD150</w:t>
+            </w:r>
+          </w:p>
+        </w:tc>
+        <w:tc>
+          <w:tcPr>
+            <w:tcW w:type="dxa" w:w="1800"/>
+            <w:tcBorders>
+              <w:top w:val="single" w:color="CCCCCC" w:sz="1"/>
+              <w:left w:val="single" w:color="CCCCCC" w:sz="1"/>
+              <w:bottom w:val="single" w:color="CCCCCC" w:sz="1"/>
+              <w:right w:val="single" w:color="CCCCCC" w:sz="1"/>
+            </w:tcBorders>
+            <w:shd w:fill="EEF4F9" w:val="clear"/>
+            <w:tcMar>
+              <w:top w:type="dxa" w:w="80"/>
+              <w:left w:type="dxa" w:w="120"/>
+              <w:bottom w:type="dxa" w:w="80"/>
+              <w:right w:type="dxa" w:w="120"/>
+            </w:tcMar>
+          </w:tcPr>
+          <w:p>
+            <w:r>
+              <w:rPr>
+                <w:rFonts w:ascii="Arial" w:cs="Arial" w:eastAsia="Arial" w:hAnsi="Arial"/>
+                <w:sz w:val="20"/>
+                <w:szCs w:val="20"/>
+              </w:rPr>
+              <w:t xml:space="preserve">Hypermethylated</w:t>
+            </w:r>
+          </w:p>
+        </w:tc>
+        <w:tc>
+          <w:tcPr>
+            <w:tcW w:type="dxa" w:w="4760"/>
+            <w:tcBorders>
+              <w:top w:val="single" w:color="CCCCCC" w:sz="1"/>
+              <w:left w:val="single" w:color="CCCCCC" w:sz="1"/>
+              <w:bottom w:val="single" w:color="CCCCCC" w:sz="1"/>
+              <w:right w:val="single" w:color="CCCCCC" w:sz="1"/>
+            </w:tcBorders>
+            <w:shd w:fill="EEF4F9" w:val="clear"/>
+            <w:tcMar>
+              <w:top w:type="dxa" w:w="80"/>
+              <w:left w:type="dxa" w:w="120"/>
+              <w:bottom w:type="dxa" w:w="80"/>
+              <w:right w:type="dxa" w:w="120"/>
+            </w:tcMar>
+          </w:tcPr>
+          <w:p>
+            <w:r>
+              <w:rPr>
+                <w:rFonts w:ascii="Arial" w:cs="Arial" w:eastAsia="Arial" w:hAnsi="Arial"/>
+                <w:sz w:val="20"/>
+                <w:szCs w:val="20"/>
+              </w:rPr>
+              <w:t xml:space="preserve">All 8 CpGs show positive delta beta — opposite to all other cohorts</w:t>
+            </w:r>
+          </w:p>
+        </w:tc>
+      </w:tr>
+    </w:tbl>
+    <w:p>
+      <w:pPr>
+        <w:spacing w:after="60" w:before="60"/>
+      </w:pPr>
+      <w:r>
+        <w:t xml:space="preserve"/>
+      </w:r>
+    </w:p>
+    <w:p>
+      <w:pPr>
+        <w:spacing w:after="80" w:before="80"/>
+      </w:pPr>
+      <w:r>
+        <w:rPr>
+          <w:rFonts w:ascii="Arial" w:cs="Arial" w:eastAsia="Arial" w:hAnsi="Arial"/>
+          <w:sz w:val="22"/>
+          <w:szCs w:val="22"/>
+        </w:rPr>
+        <w:t xml:space="preserve">The predominant direction across most cohorts is hypomethylation in exposed animals. This indicates that early-life adversity is associated with loss of methylation at this enhancer element — consistent with increased chromatin accessibility and potentially elevated transcriptional activity of the target gene.</w:t>
+      </w:r>
+    </w:p>
+    <w:p>
+      <w:pPr>
+        <w:spacing w:after="60" w:before="60"/>
+      </w:pPr>
+      <w:r>
+        <w:t xml:space="preserve"/>
+      </w:r>
+    </w:p>
+    <w:p>
+      <w:pPr>
+        <w:spacing w:after="80" w:before="80"/>
+      </w:pPr>
+      <w:r>
+        <w:rPr>
+          <w:rFonts w:ascii="Arial" w:cs="Arial" w:eastAsia="Arial" w:hAnsi="Arial"/>
+          <w:sz w:val="22"/>
+          <w:szCs w:val="22"/>
+        </w:rPr>
+        <w:t xml:space="preserve">The exception is cfdna_GD150, which shows consistent hypermethylation across all 8 hotspot CpGs. This directional reversal at late gestation (GD150) suggests a dynamic epigenetic response: early adversity may initially open this enhancer but by late gestation the regulatory response reverses, potentially representing a compensatory or developmental re-programming event.</w:t>
       </w:r>
     </w:p>
     <w:p>
@@ -3340,7 +3799,7 @@
           <w:sz w:val="22"/>
           <w:szCs w:val="22"/>
         </w:rPr>
-        <w:t xml:space="preserve">Proposed conclusion for publication: "Using a multi-cohort machine learning and meta-analysis framework across 9 WGBS datasets, we identified a 74 bp hotspot (chr10:2435505–2435579 in rheMac; chr22:49,047,163–49,047,237 in hg38) within the gene body that overlaps an ENCODE4 candidate enhancer with strong H3K27Ac signal. CpG methylation at this element showed directionally consistent changes across wildfire, stress, obesity, and cfDNA exposure cohorts (consistency scores up to 1.0), suggesting a shared epigenetic response to early-life adversity at a functional regulatory element, warranting replication in larger cohorts."</w:t>
+        <w:t xml:space="preserve">Proposed conclusion: "At a confirmed ENCODE4 enhancer element (chr10:2435505–2435579 in rheMac; chr22:49,047,165–49,047,235 in hg38) bound by the stress-responsive AP-1 transcription factor JUN and marked by H3K27Ac, early-life adversity is predominantly associated with hypomethylation in exposed animals across stress, obesity, and early cfDNA timepoint cohorts. The late gestational cfDNA cohort (GD150) shows the opposite direction, suggesting a dynamic methylation response at this locus across gestation. These findings warrant replication in larger cohorts with matched gene expression data."</w:t>
       </w:r>
     </w:p>
     <w:p>
@@ -3943,7 +4402,7 @@
                 <w:sz w:val="20"/>
                 <w:szCs w:val="20"/>
               </w:rPr>
-              <w:t xml:space="preserve">Validate top gene body CpGs in new macaque or human datasets with larger n</w:t>
+              <w:t xml:space="preserve">Validate hypomethylation at hotspot CpGs in new macaque or human datasets with larger n</w:t>
             </w:r>
           </w:p>
         </w:tc>
@@ -3973,7 +4432,7 @@
                 <w:sz w:val="20"/>
                 <w:szCs w:val="20"/>
               </w:rPr>
-              <w:t xml:space="preserve">Genome-wide / DMR-wide expansion</w:t>
+              <w:t xml:space="preserve">Gene expression integration</w:t>
             </w:r>
           </w:p>
         </w:tc>
@@ -4001,7 +4460,7 @@
                 <w:sz w:val="20"/>
                 <w:szCs w:val="20"/>
               </w:rPr>
-              <w:t xml:space="preserve">Apply the same pipeline across all DMRs, not just this one locus</w:t>
+              <w:t xml:space="preserve">Correlate hotspot methylation with RNA-seq — hypomethylation predicts increased expression</w:t>
             </w:r>
           </w:p>
         </w:tc>
@@ -4031,7 +4490,7 @@
                 <w:sz w:val="20"/>
                 <w:szCs w:val="20"/>
               </w:rPr>
-              <w:t xml:space="preserve">Gene expression integration</w:t>
+              <w:t xml:space="preserve">cfDNA longitudinal trajectory</w:t>
             </w:r>
           </w:p>
         </w:tc>
@@ -4059,7 +4518,7 @@
                 <w:sz w:val="20"/>
                 <w:szCs w:val="20"/>
               </w:rPr>
-              <w:t xml:space="preserve">Correlate gene body methylation with RNA-seq to confirm functional relevance of the enhancer element</w:t>
+              <w:t xml:space="preserve">Model methylation direction change across GD45/90/120/150 — GD150 reversal warrants formal trajectory analysis</w:t>
             </w:r>
           </w:p>
         </w:tc>
@@ -4089,7 +4548,7 @@
                 <w:sz w:val="20"/>
                 <w:szCs w:val="20"/>
               </w:rPr>
-              <w:t xml:space="preserve">Pooled cross-cohort ML</w:t>
+              <w:t xml:space="preserve">Genome-wide / DMR-wide expansion</w:t>
             </w:r>
           </w:p>
         </w:tc>
@@ -4117,7 +4576,7 @@
                 <w:sz w:val="20"/>
                 <w:szCs w:val="20"/>
               </w:rPr>
-              <w:t xml:space="preserve">Combine all samples (n ~ 130 total) for a single higher-powered classifier</w:t>
+              <w:t xml:space="preserve">Apply the same pipeline across all DMRs, not just this locus</w:t>
             </w:r>
           </w:p>
         </w:tc>
@@ -4147,7 +4606,7 @@
                 <w:sz w:val="20"/>
                 <w:szCs w:val="20"/>
               </w:rPr>
-              <w:t xml:space="preserve">cfDNA longitudinal trajectory</w:t>
+              <w:t xml:space="preserve">Pooled cross-cohort ML</w:t>
             </w:r>
           </w:p>
         </w:tc>
@@ -4175,7 +4634,7 @@
                 <w:sz w:val="20"/>
                 <w:szCs w:val="20"/>
               </w:rPr>
-              <w:t xml:space="preserve">Model methylation change across GD45/90/120/150 with linear mixed models</w:t>
+              <w:t xml:space="preserve">Combine all samples (n ~ 130) for a higher-powered classifier excluding cfdna_GD150</w:t>
             </w:r>
           </w:p>
         </w:tc>
@@ -4233,7 +4692,7 @@
                 <w:sz w:val="20"/>
                 <w:szCs w:val="20"/>
               </w:rPr>
-              <w:t xml:space="preserve">ChIP-seq or ATAC-seq at the 74 bp hotspot to confirm regulatory activity in macaque tissue</w:t>
+              <w:t xml:space="preserve">ATAC-seq or ChIP-seq at the hotspot to confirm chromatin accessibility changes in macaque tissue</w:t>
             </w:r>
           </w:p>
         </w:tc>
@@ -4479,7 +4938,7 @@
                 <w:sz w:val="20"/>
                 <w:szCs w:val="20"/>
               </w:rPr>
-              <w:t xml:space="preserve">CpG island</w:t>
+              <w:t xml:space="preserve">Delta beta (Δβ)</w:t>
             </w:r>
           </w:p>
         </w:tc>
@@ -4507,7 +4966,7 @@
                 <w:sz w:val="20"/>
                 <w:szCs w:val="20"/>
               </w:rPr>
-              <w:t xml:space="preserve">CpG-dense region near gene promoters; methylation here silences gene expression</w:t>
+              <w:t xml:space="preserve">Mean beta(case) − mean beta(control); negative = hypomethylated in exposed animals</w:t>
             </w:r>
           </w:p>
         </w:tc>
@@ -4623,7 +5082,7 @@
                 <w:sz w:val="20"/>
                 <w:szCs w:val="20"/>
               </w:rPr>
-              <w:t xml:space="preserve">Candidate cis-regulatory element from ENCODE project; classified by chromatin state (enhancer, promoter, CTCF-only, etc.)</w:t>
+              <w:t xml:space="preserve">Candidate cis-regulatory element; classified by chromatin state (enhancer, promoter, CTCF-only)</w:t>
             </w:r>
           </w:p>
         </w:tc>
@@ -4681,7 +5140,7 @@
                 <w:sz w:val="20"/>
                 <w:szCs w:val="20"/>
               </w:rPr>
-              <w:t xml:space="preserve">Histone mark associated with active enhancers and promoters; strong signal indicates regulatory activity</w:t>
+              <w:t xml:space="preserve">Histone mark at active enhancers and promoters; strong signal = regulatory activity</w:t>
             </w:r>
           </w:p>
         </w:tc>
@@ -4711,7 +5170,7 @@
                 <w:sz w:val="20"/>
                 <w:szCs w:val="20"/>
               </w:rPr>
-              <w:t xml:space="preserve">PhyloP</w:t>
+              <w:t xml:space="preserve">Hi-C / Micro-C</w:t>
             </w:r>
           </w:p>
         </w:tc>
@@ -4739,7 +5198,7 @@
                 <w:sz w:val="20"/>
                 <w:szCs w:val="20"/>
               </w:rPr>
-              <w:t xml:space="preserve">Conservation score across vertebrates; positive = conserved, negative = accelerated evolution</w:t>
+              <w:t xml:space="preserve">Chromatin conformation capture — detects DNA looping between enhancers and promoters</w:t>
             </w:r>
           </w:p>
         </w:tc>
@@ -4769,7 +5228,7 @@
                 <w:sz w:val="20"/>
                 <w:szCs w:val="20"/>
               </w:rPr>
-              <w:t xml:space="preserve">dELS / pELS</w:t>
+              <w:t xml:space="preserve">ReMap density</w:t>
             </w:r>
           </w:p>
         </w:tc>
@@ -4797,7 +5256,7 @@
                 <w:sz w:val="20"/>
                 <w:szCs w:val="20"/>
               </w:rPr>
-              <w:t xml:space="preserve">Distal / Proximal Enhancer-Like Sequence — ENCODE cCRE classifications for enhancer elements</w:t>
+              <w:t xml:space="preserve">Number of independent ChIP-seq experiments showing TF binding at a given position</w:t>
             </w:r>
           </w:p>
         </w:tc>
@@ -4827,7 +5286,7 @@
                 <w:sz w:val="20"/>
                 <w:szCs w:val="20"/>
               </w:rPr>
-              <w:t xml:space="preserve">LOOCV</w:t>
+              <w:t xml:space="preserve">JUN / AP-1</w:t>
             </w:r>
           </w:p>
         </w:tc>
@@ -4855,7 +5314,7 @@
                 <w:sz w:val="20"/>
                 <w:szCs w:val="20"/>
               </w:rPr>
-              <w:t xml:space="preserve">Leave-One-Out Cross-Validation — used when n &lt; 30</w:t>
+              <w:t xml:space="preserve">Stress-responsive transcription factor; binding is blocked by CpG methylation</w:t>
             </w:r>
           </w:p>
         </w:tc>
@@ -4885,7 +5344,7 @@
                 <w:sz w:val="20"/>
                 <w:szCs w:val="20"/>
               </w:rPr>
-              <w:t xml:space="preserve">ElasticNet</w:t>
+              <w:t xml:space="preserve">EZH2</w:t>
             </w:r>
           </w:p>
         </w:tc>
@@ -4913,7 +5372,7 @@
                 <w:sz w:val="20"/>
                 <w:szCs w:val="20"/>
               </w:rPr>
-              <w:t xml:space="preserve">Logistic regression with L1+L2 regularisation for high-dimensional feature selection</w:t>
+              <w:t xml:space="preserve">PRC2 complex methyltransferase; writes repressive H3K27me3 mark</w:t>
             </w:r>
           </w:p>
         </w:tc>
@@ -4943,7 +5402,7 @@
                 <w:sz w:val="20"/>
                 <w:szCs w:val="20"/>
               </w:rPr>
-              <w:t xml:space="preserve">MOFA+</w:t>
+              <w:t xml:space="preserve">PhyloP</w:t>
             </w:r>
           </w:p>
         </w:tc>
@@ -4971,7 +5430,7 @@
                 <w:sz w:val="20"/>
                 <w:szCs w:val="20"/>
               </w:rPr>
-              <w:t xml:space="preserve">Multi-Omics Factor Analysis v2 — finds shared latent factors across multiple datasets</w:t>
+              <w:t xml:space="preserve">Conservation score; positive = conserved, negative = accelerated evolution</w:t>
             </w:r>
           </w:p>
         </w:tc>
@@ -5001,7 +5460,7 @@
                 <w:sz w:val="20"/>
                 <w:szCs w:val="20"/>
               </w:rPr>
-              <w:t xml:space="preserve">Stouffer's Z</w:t>
+              <w:t xml:space="preserve">MOFA+</w:t>
             </w:r>
           </w:p>
         </w:tc>
@@ -5029,7 +5488,7 @@
                 <w:sz w:val="20"/>
                 <w:szCs w:val="20"/>
               </w:rPr>
-              <w:t xml:space="preserve">Meta-analysis method combining signed Z-scores weighted by sample size</w:t>
+              <w:t xml:space="preserve">Multi-Omics Factor Analysis v2 — finds shared latent factors across multiple datasets</w:t>
             </w:r>
           </w:p>
         </w:tc>
@@ -5059,7 +5518,7 @@
                 <w:sz w:val="20"/>
                 <w:szCs w:val="20"/>
               </w:rPr>
-              <w:t xml:space="preserve">FDR</w:t>
+              <w:t xml:space="preserve">Stouffer's Z</w:t>
             </w:r>
           </w:p>
         </w:tc>
@@ -5087,7 +5546,7 @@
                 <w:sz w:val="20"/>
                 <w:szCs w:val="20"/>
               </w:rPr>
-              <w:t xml:space="preserve">False Discovery Rate — Benjamini-Hochberg correction for multiple testing</w:t>
+              <w:t xml:space="preserve">Meta-analysis combining signed Z-scores weighted by sample size</w:t>
             </w:r>
           </w:p>
         </w:tc>
@@ -5117,7 +5576,7 @@
                 <w:sz w:val="20"/>
                 <w:szCs w:val="20"/>
               </w:rPr>
-              <w:t xml:space="preserve">Consistency score</w:t>
+              <w:t xml:space="preserve">FDR</w:t>
             </w:r>
           </w:p>
         </w:tc>
@@ -5145,7 +5604,7 @@
                 <w:sz w:val="20"/>
                 <w:szCs w:val="20"/>
               </w:rPr>
-              <w:t xml:space="preserve">Fraction of cohorts showing the same direction of delta beta for a given CpG</w:t>
+              <w:t xml:space="preserve">False Discovery Rate — Benjamini-Hochberg correction for multiple testing</w:t>
             </w:r>
           </w:p>
         </w:tc>
@@ -5175,7 +5634,7 @@
                 <w:sz w:val="20"/>
                 <w:szCs w:val="20"/>
               </w:rPr>
-              <w:t xml:space="preserve">Delta beta (Δβ)</w:t>
+              <w:t xml:space="preserve">Consistency score</w:t>
             </w:r>
           </w:p>
         </w:tc>
@@ -5203,7 +5662,65 @@
                 <w:sz w:val="20"/>
                 <w:szCs w:val="20"/>
               </w:rPr>
-              <w:t xml:space="preserve">Mean beta(case) − mean beta(control); positive = hypermethylated in exposed animals</w:t>
+              <w:t xml:space="preserve">Fraction of cohorts showing the same direction of delta beta for a given CpG</w:t>
+            </w:r>
+          </w:p>
+        </w:tc>
+      </w:tr>
+      <w:tr>
+        <w:tc>
+          <w:tcPr>
+            <w:tcW w:type="dxa" w:w="2200"/>
+            <w:tcBorders>
+              <w:top w:val="single" w:color="CCCCCC" w:sz="1"/>
+              <w:left w:val="single" w:color="CCCCCC" w:sz="1"/>
+              <w:bottom w:val="single" w:color="CCCCCC" w:sz="1"/>
+              <w:right w:val="single" w:color="CCCCCC" w:sz="1"/>
+            </w:tcBorders>
+            <w:shd w:fill="EEF4F9" w:val="clear"/>
+            <w:tcMar>
+              <w:top w:type="dxa" w:w="80"/>
+              <w:left w:type="dxa" w:w="120"/>
+              <w:bottom w:type="dxa" w:w="80"/>
+              <w:right w:type="dxa" w:w="120"/>
+            </w:tcMar>
+          </w:tcPr>
+          <w:p>
+            <w:r>
+              <w:rPr>
+                <w:rFonts w:ascii="Arial" w:cs="Arial" w:eastAsia="Arial" w:hAnsi="Arial"/>
+                <w:sz w:val="20"/>
+                <w:szCs w:val="20"/>
+              </w:rPr>
+              <w:t xml:space="preserve">dELS / pELS</w:t>
+            </w:r>
+          </w:p>
+        </w:tc>
+        <w:tc>
+          <w:tcPr>
+            <w:tcW w:type="dxa" w:w="7160"/>
+            <w:tcBorders>
+              <w:top w:val="single" w:color="CCCCCC" w:sz="1"/>
+              <w:left w:val="single" w:color="CCCCCC" w:sz="1"/>
+              <w:bottom w:val="single" w:color="CCCCCC" w:sz="1"/>
+              <w:right w:val="single" w:color="CCCCCC" w:sz="1"/>
+            </w:tcBorders>
+            <w:shd w:fill="EEF4F9" w:val="clear"/>
+            <w:tcMar>
+              <w:top w:type="dxa" w:w="80"/>
+              <w:left w:type="dxa" w:w="120"/>
+              <w:bottom w:type="dxa" w:w="80"/>
+              <w:right w:type="dxa" w:w="120"/>
+            </w:tcMar>
+          </w:tcPr>
+          <w:p>
+            <w:r>
+              <w:rPr>
+                <w:rFonts w:ascii="Arial" w:cs="Arial" w:eastAsia="Arial" w:hAnsi="Arial"/>
+                <w:sz w:val="20"/>
+                <w:szCs w:val="20"/>
+              </w:rPr>
+              <w:t xml:space="preserve">Distal / Proximal Enhancer-Like Sequence — ENCODE cCRE enhancer classifications</w:t>
             </w:r>
           </w:p>
         </w:tc>

</xml_diff>